<commit_message>
feat: publish comprehensive ESD courseware v3.1
</commit_message>
<xml_diff>
--- a/courseware/LP-Electrostatic-Discharge-ESD-Control.docx
+++ b/courseware/LP-Electrostatic-Discharge-ESD-Control.docx
@@ -218,7 +218,7 @@
           <w:color w:val="1F6FEB"/>
           <w:sz w:val="24"/>
         </w:rPr>
-        <w:t>Version 3.0</w:t>
+        <w:t>Version 3.1</w:t>
       </w:r>
     </w:p>
     <w:p>
@@ -438,6 +438,64 @@
           </w:p>
         </w:tc>
       </w:tr>
+      <w:tr>
+        <w:tc>
+          <w:tcPr>
+            <w:tcW w:type="dxa" w:w="2556"/>
+          </w:tcPr>
+          <w:p>
+            <w:r/>
+            <w:r>
+              <w:rPr>
+                <w:sz w:val="19"/>
+              </w:rPr>
+              <w:t>3.1</w:t>
+            </w:r>
+          </w:p>
+        </w:tc>
+        <w:tc>
+          <w:tcPr>
+            <w:tcW w:type="dxa" w:w="2556"/>
+          </w:tcPr>
+          <w:p>
+            <w:r/>
+            <w:r>
+              <w:rPr>
+                <w:sz w:val="19"/>
+              </w:rPr>
+              <w:t>20 August 2026</w:t>
+            </w:r>
+          </w:p>
+        </w:tc>
+        <w:tc>
+          <w:tcPr>
+            <w:tcW w:type="dxa" w:w="2556"/>
+          </w:tcPr>
+          <w:p>
+            <w:r/>
+            <w:r>
+              <w:rPr>
+                <w:sz w:val="19"/>
+              </w:rPr>
+              <w:t>Updated slide map for the logically sequenced v3.1 deck with integrated ESD photographs and contextual technical figures.</w:t>
+            </w:r>
+          </w:p>
+        </w:tc>
+        <w:tc>
+          <w:tcPr>
+            <w:tcW w:type="dxa" w:w="2556"/>
+          </w:tcPr>
+          <w:p>
+            <w:r/>
+            <w:r>
+              <w:rPr>
+                <w:sz w:val="19"/>
+              </w:rPr>
+              <w:t>Tertiary Infotech Academy Pte Ltd</w:t>
+            </w:r>
+          </w:p>
+        </w:tc>
+      </w:tr>
     </w:tbl>
     <w:p>
       <w:r>
@@ -462,14 +520,14 @@
         <w:tabs>
           <w:tab w:pos="9072" w:val="right" w:leader="dot"/>
         </w:tabs>
-        <w:spacing w:after="60"/>
+        <w:spacing w:after="0" w:line="240" w:lineRule="auto"/>
       </w:pPr>
       <w:r>
         <w:rPr>
           <w:rFonts w:ascii="Arial" w:hAnsi="Arial"/>
           <w:b/>
           <w:color w:val="333333"/>
-          <w:sz w:val="22"/>
+          <w:sz w:val="18"/>
         </w:rPr>
         <w:t>Course Overview</w:t>
         <w:tab/>
@@ -481,14 +539,14 @@
         <w:tabs>
           <w:tab w:pos="9072" w:val="right" w:leader="dot"/>
         </w:tabs>
-        <w:spacing w:after="60"/>
+        <w:spacing w:after="0" w:line="240" w:lineRule="auto"/>
       </w:pPr>
       <w:r>
         <w:rPr>
           <w:rFonts w:ascii="Arial" w:hAnsi="Arial"/>
           <w:b/>
           <w:color w:val="333333"/>
-          <w:sz w:val="22"/>
+          <w:sz w:val="18"/>
         </w:rPr>
         <w:t>Learning Outcomes</w:t>
         <w:tab/>
@@ -500,14 +558,14 @@
         <w:tabs>
           <w:tab w:pos="9072" w:val="right" w:leader="dot"/>
         </w:tabs>
-        <w:spacing w:after="60"/>
+        <w:spacing w:after="0" w:line="240" w:lineRule="auto"/>
       </w:pPr>
       <w:r>
         <w:rPr>
           <w:rFonts w:ascii="Arial" w:hAnsi="Arial"/>
           <w:b/>
           <w:color w:val="333333"/>
-          <w:sz w:val="22"/>
+          <w:sz w:val="18"/>
         </w:rPr>
         <w:t>Day 1 Schedule</w:t>
         <w:tab/>
@@ -519,14 +577,14 @@
         <w:tabs>
           <w:tab w:pos="9072" w:val="right" w:leader="dot"/>
         </w:tabs>
-        <w:spacing w:after="60"/>
+        <w:spacing w:after="0" w:line="240" w:lineRule="auto"/>
       </w:pPr>
       <w:r>
         <w:rPr>
           <w:rFonts w:ascii="Arial" w:hAnsi="Arial"/>
           <w:b/>
           <w:color w:val="333333"/>
-          <w:sz w:val="22"/>
+          <w:sz w:val="18"/>
         </w:rPr>
         <w:t>Day 2 Schedule</w:t>
         <w:tab/>
@@ -538,14 +596,14 @@
         <w:tabs>
           <w:tab w:pos="9072" w:val="right" w:leader="dot"/>
         </w:tabs>
-        <w:spacing w:after="60"/>
+        <w:spacing w:after="0" w:line="240" w:lineRule="auto"/>
       </w:pPr>
       <w:r>
         <w:rPr>
           <w:rFonts w:ascii="Arial" w:hAnsi="Arial"/>
           <w:b/>
           <w:color w:val="333333"/>
-          <w:sz w:val="22"/>
+          <w:sz w:val="18"/>
         </w:rPr>
         <w:t>Activity and Assessment Alignment</w:t>
         <w:tab/>
@@ -728,7 +786,7 @@
           </w:tcPr>
           <w:p>
             <w:r>
-              <w:t>15–105</w:t>
+              <w:t>15–49</w:t>
             </w:r>
           </w:p>
         </w:tc>
@@ -798,7 +856,7 @@
           </w:tcPr>
           <w:p>
             <w:r>
-              <w:t>15–105</w:t>
+              <w:t>15–49</w:t>
             </w:r>
           </w:p>
         </w:tc>
@@ -833,7 +891,7 @@
           </w:tcPr>
           <w:p>
             <w:r>
-              <w:t>15–105, A1: 99–101, A2: 102–104</w:t>
+              <w:t>15–49, A1: 43–45, A2: 46–48</w:t>
             </w:r>
           </w:p>
         </w:tc>
@@ -903,7 +961,7 @@
           </w:tcPr>
           <w:p>
             <w:r>
-              <w:t>106–151</w:t>
+              <w:t>50–77</w:t>
             </w:r>
           </w:p>
         </w:tc>
@@ -973,7 +1031,7 @@
           </w:tcPr>
           <w:p>
             <w:r>
-              <w:t>106–151</w:t>
+              <w:t>50–77</w:t>
             </w:r>
           </w:p>
         </w:tc>
@@ -1008,7 +1066,7 @@
           </w:tcPr>
           <w:p>
             <w:r>
-              <w:t>A3: 145–147, A4: 148–150</w:t>
+              <w:t>A3: 71–73, A4: 74–76</w:t>
             </w:r>
           </w:p>
         </w:tc>
@@ -1181,7 +1239,7 @@
           </w:tcPr>
           <w:p>
             <w:r>
-              <w:t>153–178</w:t>
+              <w:t>79–102</w:t>
             </w:r>
           </w:p>
         </w:tc>
@@ -1251,7 +1309,7 @@
           </w:tcPr>
           <w:p>
             <w:r>
-              <w:t>153–178</w:t>
+              <w:t>79–102</w:t>
             </w:r>
           </w:p>
         </w:tc>
@@ -1286,7 +1344,7 @@
           </w:tcPr>
           <w:p>
             <w:r>
-              <w:t>A5: 172–174, A6: 175–177</w:t>
+              <w:t>A5: 96–98, A6: 99–101</w:t>
             </w:r>
           </w:p>
         </w:tc>
@@ -1356,7 +1414,7 @@
           </w:tcPr>
           <w:p>
             <w:r>
-              <w:t>180–199</w:t>
+              <w:t>104–123</w:t>
             </w:r>
           </w:p>
         </w:tc>
@@ -1426,7 +1484,7 @@
           </w:tcPr>
           <w:p>
             <w:r>
-              <w:t>A7: 193–195</w:t>
+              <w:t>A7: 117–119</w:t>
             </w:r>
           </w:p>
         </w:tc>
@@ -1461,7 +1519,7 @@
           </w:tcPr>
           <w:p>
             <w:r>
-              <w:t>A8: 196–198</w:t>
+              <w:t>A8: 120–122</w:t>
             </w:r>
           </w:p>
         </w:tc>
@@ -1607,9 +1665,16 @@
         <w:tc>
           <w:tcPr>
             <w:tcW w:type="dxa" w:w="2556"/>
+            <w:vAlign w:val="top"/>
           </w:tcPr>
           <w:p>
+            <w:pPr>
+              <w:spacing w:after="0" w:line="216" w:lineRule="auto"/>
+            </w:pPr>
             <w:r>
+              <w:rPr>
+                <w:sz w:val="16"/>
+              </w:rPr>
               <w:t>1. Static Hazard Hunt at NovaSense Incoming Inspection</w:t>
             </w:r>
           </w:p>
@@ -1617,9 +1682,16 @@
         <w:tc>
           <w:tcPr>
             <w:tcW w:type="dxa" w:w="2556"/>
+            <w:vAlign w:val="top"/>
           </w:tcPr>
           <w:p>
+            <w:pPr>
+              <w:spacing w:after="0" w:line="216" w:lineRule="auto"/>
+            </w:pPr>
             <w:r>
+              <w:rPr>
+                <w:sz w:val="16"/>
+              </w:rPr>
               <w:t>K1 · A1</w:t>
             </w:r>
           </w:p>
@@ -1627,9 +1699,16 @@
         <w:tc>
           <w:tcPr>
             <w:tcW w:type="dxa" w:w="2556"/>
+            <w:vAlign w:val="top"/>
           </w:tcPr>
           <w:p>
+            <w:pPr>
+              <w:spacing w:after="0" w:line="216" w:lineRule="auto"/>
+            </w:pPr>
             <w:r>
+              <w:rPr>
+                <w:sz w:val="16"/>
+              </w:rPr>
               <w:t>Annotated hazard map; Risk-prioritisation worksheet; Three-control proposal; Peer-review note</w:t>
             </w:r>
           </w:p>
@@ -1637,9 +1716,366 @@
         <w:tc>
           <w:tcPr>
             <w:tcW w:type="dxa" w:w="2556"/>
+            <w:vAlign w:val="top"/>
           </w:tcPr>
           <w:p>
+            <w:pPr>
+              <w:spacing w:after="0" w:line="216" w:lineRule="auto"/>
+            </w:pPr>
             <w:r>
+              <w:rPr>
+                <w:sz w:val="16"/>
+              </w:rPr>
+              <w:t>43–45</w:t>
+            </w:r>
+          </w:p>
+        </w:tc>
+      </w:tr>
+      <w:tr>
+        <w:tc>
+          <w:tcPr>
+            <w:tcW w:type="dxa" w:w="2556"/>
+            <w:vAlign w:val="top"/>
+          </w:tcPr>
+          <w:p>
+            <w:pPr>
+              <w:spacing w:after="0" w:line="216" w:lineRule="auto"/>
+            </w:pPr>
+            <w:r>
+              <w:rPr>
+                <w:sz w:val="16"/>
+              </w:rPr>
+              <w:t>2. Medical Microchip Failure Triage: ESD, EOS or Process Defect?</w:t>
+            </w:r>
+          </w:p>
+        </w:tc>
+        <w:tc>
+          <w:tcPr>
+            <w:tcW w:type="dxa" w:w="2556"/>
+            <w:vAlign w:val="top"/>
+          </w:tcPr>
+          <w:p>
+            <w:pPr>
+              <w:spacing w:after="0" w:line="216" w:lineRule="auto"/>
+            </w:pPr>
+            <w:r>
+              <w:rPr>
+                <w:sz w:val="16"/>
+              </w:rPr>
+              <w:t>K1 · A1</w:t>
+            </w:r>
+          </w:p>
+        </w:tc>
+        <w:tc>
+          <w:tcPr>
+            <w:tcW w:type="dxa" w:w="2556"/>
+            <w:vAlign w:val="top"/>
+          </w:tcPr>
+          <w:p>
+            <w:pPr>
+              <w:spacing w:after="0" w:line="216" w:lineRule="auto"/>
+            </w:pPr>
+            <w:r>
+              <w:rPr>
+                <w:sz w:val="16"/>
+              </w:rPr>
+              <w:t>Chronology; Hypothesis matrix; Containment plan; Decision-gate briefing</w:t>
+            </w:r>
+          </w:p>
+        </w:tc>
+        <w:tc>
+          <w:tcPr>
+            <w:tcW w:type="dxa" w:w="2556"/>
+            <w:vAlign w:val="top"/>
+          </w:tcPr>
+          <w:p>
+            <w:pPr>
+              <w:spacing w:after="0" w:line="216" w:lineRule="auto"/>
+            </w:pPr>
+            <w:r>
+              <w:rPr>
+                <w:sz w:val="16"/>
+              </w:rPr>
+              <w:t>46–48</w:t>
+            </w:r>
+          </w:p>
+        </w:tc>
+      </w:tr>
+      <w:tr>
+        <w:tc>
+          <w:tcPr>
+            <w:tcW w:type="dxa" w:w="2556"/>
+            <w:vAlign w:val="top"/>
+          </w:tcPr>
+          <w:p>
+            <w:pPr>
+              <w:spacing w:after="0" w:line="216" w:lineRule="auto"/>
+            </w:pPr>
+            <w:r>
+              <w:rPr>
+                <w:sz w:val="16"/>
+              </w:rPr>
+              <w:t>3. Design and Commission an EPA for Orion Optics</w:t>
+            </w:r>
+          </w:p>
+        </w:tc>
+        <w:tc>
+          <w:tcPr>
+            <w:tcW w:type="dxa" w:w="2556"/>
+            <w:vAlign w:val="top"/>
+          </w:tcPr>
+          <w:p>
+            <w:pPr>
+              <w:spacing w:after="0" w:line="216" w:lineRule="auto"/>
+            </w:pPr>
+            <w:r>
+              <w:rPr>
+                <w:sz w:val="16"/>
+              </w:rPr>
+              <w:t>K3 · K4 · A1</w:t>
+            </w:r>
+          </w:p>
+        </w:tc>
+        <w:tc>
+          <w:tcPr>
+            <w:tcW w:type="dxa" w:w="2556"/>
+            <w:vAlign w:val="top"/>
+          </w:tcPr>
+          <w:p>
+            <w:pPr>
+              <w:spacing w:after="0" w:line="216" w:lineRule="auto"/>
+            </w:pPr>
+            <w:r>
+              <w:rPr>
+                <w:sz w:val="16"/>
+              </w:rPr>
+              <w:t>EPA layout; Grounding/bonding diagram; Insulator-control register; Commissioning plan and readiness certificate</w:t>
+            </w:r>
+          </w:p>
+        </w:tc>
+        <w:tc>
+          <w:tcPr>
+            <w:tcW w:type="dxa" w:w="2556"/>
+            <w:vAlign w:val="top"/>
+          </w:tcPr>
+          <w:p>
+            <w:pPr>
+              <w:spacing w:after="0" w:line="216" w:lineRule="auto"/>
+            </w:pPr>
+            <w:r>
+              <w:rPr>
+                <w:sz w:val="16"/>
+              </w:rPr>
+              <w:t>71–73</w:t>
+            </w:r>
+          </w:p>
+        </w:tc>
+      </w:tr>
+      <w:tr>
+        <w:tc>
+          <w:tcPr>
+            <w:tcW w:type="dxa" w:w="2556"/>
+            <w:vAlign w:val="top"/>
+          </w:tcPr>
+          <w:p>
+            <w:pPr>
+              <w:spacing w:after="0" w:line="216" w:lineRule="auto"/>
+            </w:pPr>
+            <w:r>
+              <w:rPr>
+                <w:sz w:val="16"/>
+              </w:rPr>
+              <w:t>4. Select Controls for the Aster Robotics Handling Cell</w:t>
+            </w:r>
+          </w:p>
+        </w:tc>
+        <w:tc>
+          <w:tcPr>
+            <w:tcW w:type="dxa" w:w="2556"/>
+            <w:vAlign w:val="top"/>
+          </w:tcPr>
+          <w:p>
+            <w:pPr>
+              <w:spacing w:after="0" w:line="216" w:lineRule="auto"/>
+            </w:pPr>
+            <w:r>
+              <w:rPr>
+                <w:sz w:val="16"/>
+              </w:rPr>
+              <w:t>K3 · K4 · A1</w:t>
+            </w:r>
+          </w:p>
+        </w:tc>
+        <w:tc>
+          <w:tcPr>
+            <w:tcW w:type="dxa" w:w="2556"/>
+            <w:vAlign w:val="top"/>
+          </w:tcPr>
+          <w:p>
+            <w:pPr>
+              <w:spacing w:after="0" w:line="216" w:lineRule="auto"/>
+            </w:pPr>
+            <w:r>
+              <w:rPr>
+                <w:sz w:val="16"/>
+              </w:rPr>
+              <w:t>Exposure-path map; Control-selection matrix; Monitoring/stop-condition plan; Maintenance plan</w:t>
+            </w:r>
+          </w:p>
+        </w:tc>
+        <w:tc>
+          <w:tcPr>
+            <w:tcW w:type="dxa" w:w="2556"/>
+            <w:vAlign w:val="top"/>
+          </w:tcPr>
+          <w:p>
+            <w:pPr>
+              <w:spacing w:after="0" w:line="216" w:lineRule="auto"/>
+            </w:pPr>
+            <w:r>
+              <w:rPr>
+                <w:sz w:val="16"/>
+              </w:rPr>
+              <w:t>74–76</w:t>
+            </w:r>
+          </w:p>
+        </w:tc>
+      </w:tr>
+      <w:tr>
+        <w:tc>
+          <w:tcPr>
+            <w:tcW w:type="dxa" w:w="2556"/>
+            <w:vAlign w:val="top"/>
+          </w:tcPr>
+          <w:p>
+            <w:pPr>
+              <w:spacing w:after="0" w:line="216" w:lineRule="auto"/>
+            </w:pPr>
+            <w:r>
+              <w:rPr>
+                <w:sz w:val="16"/>
+              </w:rPr>
+              <w:t>5. Execute a Compliance Verification Round</w:t>
+            </w:r>
+          </w:p>
+        </w:tc>
+        <w:tc>
+          <w:tcPr>
+            <w:tcW w:type="dxa" w:w="2556"/>
+            <w:vAlign w:val="top"/>
+          </w:tcPr>
+          <w:p>
+            <w:pPr>
+              <w:spacing w:after="0" w:line="216" w:lineRule="auto"/>
+            </w:pPr>
+            <w:r>
+              <w:rPr>
+                <w:sz w:val="16"/>
+              </w:rPr>
+              <w:t>K2 · K3 · A2</w:t>
+            </w:r>
+          </w:p>
+        </w:tc>
+        <w:tc>
+          <w:tcPr>
+            <w:tcW w:type="dxa" w:w="2556"/>
+            <w:vAlign w:val="top"/>
+          </w:tcPr>
+          <w:p>
+            <w:pPr>
+              <w:spacing w:after="0" w:line="216" w:lineRule="auto"/>
+            </w:pPr>
+            <w:r>
+              <w:rPr>
+                <w:sz w:val="16"/>
+              </w:rPr>
+              <w:t>Completed measurement log; Failure/disposition records; Metric calculation; Signed evidence package</w:t>
+            </w:r>
+          </w:p>
+        </w:tc>
+        <w:tc>
+          <w:tcPr>
+            <w:tcW w:type="dxa" w:w="2556"/>
+            <w:vAlign w:val="top"/>
+          </w:tcPr>
+          <w:p>
+            <w:pPr>
+              <w:spacing w:after="0" w:line="216" w:lineRule="auto"/>
+            </w:pPr>
+            <w:r>
+              <w:rPr>
+                <w:sz w:val="16"/>
+              </w:rPr>
+              <w:t>96–98</w:t>
+            </w:r>
+          </w:p>
+        </w:tc>
+      </w:tr>
+      <w:tr>
+        <w:tc>
+          <w:tcPr>
+            <w:tcW w:type="dxa" w:w="2556"/>
+            <w:vAlign w:val="top"/>
+          </w:tcPr>
+          <w:p>
+            <w:pPr>
+              <w:spacing w:after="0" w:line="216" w:lineRule="auto"/>
+            </w:pPr>
+            <w:r>
+              <w:rPr>
+                <w:sz w:val="16"/>
+              </w:rPr>
+              <w:t>6. Standards-Based EPA Audit at Helix Assembly</w:t>
+            </w:r>
+          </w:p>
+        </w:tc>
+        <w:tc>
+          <w:tcPr>
+            <w:tcW w:type="dxa" w:w="2556"/>
+            <w:vAlign w:val="top"/>
+          </w:tcPr>
+          <w:p>
+            <w:pPr>
+              <w:spacing w:after="0" w:line="216" w:lineRule="auto"/>
+            </w:pPr>
+            <w:r>
+              <w:rPr>
+                <w:sz w:val="16"/>
+              </w:rPr>
+              <w:t>K2 · A2 · A3</w:t>
+            </w:r>
+          </w:p>
+        </w:tc>
+        <w:tc>
+          <w:tcPr>
+            <w:tcW w:type="dxa" w:w="2556"/>
+            <w:vAlign w:val="top"/>
+          </w:tcPr>
+          <w:p>
+            <w:pPr>
+              <w:spacing w:after="0" w:line="216" w:lineRule="auto"/>
+            </w:pPr>
+            <w:r>
+              <w:rPr>
+                <w:sz w:val="16"/>
+              </w:rPr>
+              <w:t>Audit plan; Completed checklist; Evidence register; Graded findings and follow-up plan</w:t>
+            </w:r>
+          </w:p>
+        </w:tc>
+        <w:tc>
+          <w:tcPr>
+            <w:tcW w:type="dxa" w:w="2556"/>
+            <w:vAlign w:val="top"/>
+          </w:tcPr>
+          <w:p>
+            <w:pPr>
+              <w:spacing w:after="0" w:line="216" w:lineRule="auto"/>
+            </w:pPr>
+            <w:r>
+              <w:rPr>
+                <w:sz w:val="16"/>
+              </w:rPr>
               <w:t>99–101</w:t>
             </w:r>
           </w:p>
@@ -1649,40 +2085,68 @@
         <w:tc>
           <w:tcPr>
             <w:tcW w:type="dxa" w:w="2556"/>
+            <w:vAlign w:val="top"/>
           </w:tcPr>
           <w:p>
+            <w:pPr>
+              <w:spacing w:after="0" w:line="216" w:lineRule="auto"/>
+            </w:pPr>
             <w:r>
-              <w:t>2. Medical Microchip Failure Triage: ESD, EOS or Process Defect?</w:t>
+              <w:rPr>
+                <w:sz w:val="16"/>
+              </w:rPr>
+              <w:t>7. Investigate the PulseMed ESD Incident</w:t>
             </w:r>
           </w:p>
         </w:tc>
         <w:tc>
           <w:tcPr>
             <w:tcW w:type="dxa" w:w="2556"/>
+            <w:vAlign w:val="top"/>
           </w:tcPr>
           <w:p>
+            <w:pPr>
+              <w:spacing w:after="0" w:line="216" w:lineRule="auto"/>
+            </w:pPr>
             <w:r>
-              <w:t>K1 · A1</w:t>
+              <w:rPr>
+                <w:sz w:val="16"/>
+              </w:rPr>
+              <w:t>K4 · A2 · A3</w:t>
             </w:r>
           </w:p>
         </w:tc>
         <w:tc>
           <w:tcPr>
             <w:tcW w:type="dxa" w:w="2556"/>
+            <w:vAlign w:val="top"/>
           </w:tcPr>
           <w:p>
+            <w:pPr>
+              <w:spacing w:after="0" w:line="216" w:lineRule="auto"/>
+            </w:pPr>
             <w:r>
-              <w:t>Chronology; Hypothesis matrix; Containment plan; Decision-gate briefing</w:t>
+              <w:rPr>
+                <w:sz w:val="16"/>
+              </w:rPr>
+              <w:t>Containment record; Timeline and causal analysis; CAPA plan; Effectiveness-verification plan</w:t>
             </w:r>
           </w:p>
         </w:tc>
         <w:tc>
           <w:tcPr>
             <w:tcW w:type="dxa" w:w="2556"/>
+            <w:vAlign w:val="top"/>
           </w:tcPr>
           <w:p>
+            <w:pPr>
+              <w:spacing w:after="0" w:line="216" w:lineRule="auto"/>
+            </w:pPr>
             <w:r>
-              <w:t>102–104</w:t>
+              <w:rPr>
+                <w:sz w:val="16"/>
+              </w:rPr>
+              <w:t>117–119</w:t>
             </w:r>
           </w:p>
         </w:tc>
@@ -1691,219 +2155,16 @@
         <w:tc>
           <w:tcPr>
             <w:tcW w:type="dxa" w:w="2556"/>
+            <w:vAlign w:val="top"/>
           </w:tcPr>
           <w:p>
+            <w:pPr>
+              <w:spacing w:after="0" w:line="216" w:lineRule="auto"/>
+            </w:pPr>
             <w:r>
-              <w:t>3. Design and Commission an EPA for Orion Optics</w:t>
-            </w:r>
-          </w:p>
-        </w:tc>
-        <w:tc>
-          <w:tcPr>
-            <w:tcW w:type="dxa" w:w="2556"/>
-          </w:tcPr>
-          <w:p>
-            <w:r>
-              <w:t>K3 · K4 · A1</w:t>
-            </w:r>
-          </w:p>
-        </w:tc>
-        <w:tc>
-          <w:tcPr>
-            <w:tcW w:type="dxa" w:w="2556"/>
-          </w:tcPr>
-          <w:p>
-            <w:r>
-              <w:t>EPA layout; Grounding/bonding diagram; Insulator-control register; Commissioning plan and readiness certificate</w:t>
-            </w:r>
-          </w:p>
-        </w:tc>
-        <w:tc>
-          <w:tcPr>
-            <w:tcW w:type="dxa" w:w="2556"/>
-          </w:tcPr>
-          <w:p>
-            <w:r>
-              <w:t>145–147</w:t>
-            </w:r>
-          </w:p>
-        </w:tc>
-      </w:tr>
-      <w:tr>
-        <w:tc>
-          <w:tcPr>
-            <w:tcW w:type="dxa" w:w="2556"/>
-          </w:tcPr>
-          <w:p>
-            <w:r>
-              <w:t>4. Select Controls for the Aster Robotics Handling Cell</w:t>
-            </w:r>
-          </w:p>
-        </w:tc>
-        <w:tc>
-          <w:tcPr>
-            <w:tcW w:type="dxa" w:w="2556"/>
-          </w:tcPr>
-          <w:p>
-            <w:r>
-              <w:t>K3 · K4 · A1</w:t>
-            </w:r>
-          </w:p>
-        </w:tc>
-        <w:tc>
-          <w:tcPr>
-            <w:tcW w:type="dxa" w:w="2556"/>
-          </w:tcPr>
-          <w:p>
-            <w:r>
-              <w:t>Exposure-path map; Control-selection matrix; Monitoring/stop-condition plan; Maintenance plan</w:t>
-            </w:r>
-          </w:p>
-        </w:tc>
-        <w:tc>
-          <w:tcPr>
-            <w:tcW w:type="dxa" w:w="2556"/>
-          </w:tcPr>
-          <w:p>
-            <w:r>
-              <w:t>148–150</w:t>
-            </w:r>
-          </w:p>
-        </w:tc>
-      </w:tr>
-      <w:tr>
-        <w:tc>
-          <w:tcPr>
-            <w:tcW w:type="dxa" w:w="2556"/>
-          </w:tcPr>
-          <w:p>
-            <w:r>
-              <w:t>5. Execute a Compliance Verification Round</w:t>
-            </w:r>
-          </w:p>
-        </w:tc>
-        <w:tc>
-          <w:tcPr>
-            <w:tcW w:type="dxa" w:w="2556"/>
-          </w:tcPr>
-          <w:p>
-            <w:r>
-              <w:t>K2 · K3 · A2</w:t>
-            </w:r>
-          </w:p>
-        </w:tc>
-        <w:tc>
-          <w:tcPr>
-            <w:tcW w:type="dxa" w:w="2556"/>
-          </w:tcPr>
-          <w:p>
-            <w:r>
-              <w:t>Completed measurement log; Failure/disposition records; Metric calculation; Signed evidence package</w:t>
-            </w:r>
-          </w:p>
-        </w:tc>
-        <w:tc>
-          <w:tcPr>
-            <w:tcW w:type="dxa" w:w="2556"/>
-          </w:tcPr>
-          <w:p>
-            <w:r>
-              <w:t>172–174</w:t>
-            </w:r>
-          </w:p>
-        </w:tc>
-      </w:tr>
-      <w:tr>
-        <w:tc>
-          <w:tcPr>
-            <w:tcW w:type="dxa" w:w="2556"/>
-          </w:tcPr>
-          <w:p>
-            <w:r>
-              <w:t>6. Standards-Based EPA Audit at Helix Assembly</w:t>
-            </w:r>
-          </w:p>
-        </w:tc>
-        <w:tc>
-          <w:tcPr>
-            <w:tcW w:type="dxa" w:w="2556"/>
-          </w:tcPr>
-          <w:p>
-            <w:r>
-              <w:t>K2 · A2 · A3</w:t>
-            </w:r>
-          </w:p>
-        </w:tc>
-        <w:tc>
-          <w:tcPr>
-            <w:tcW w:type="dxa" w:w="2556"/>
-          </w:tcPr>
-          <w:p>
-            <w:r>
-              <w:t>Audit plan; Completed checklist; Evidence register; Graded findings and follow-up plan</w:t>
-            </w:r>
-          </w:p>
-        </w:tc>
-        <w:tc>
-          <w:tcPr>
-            <w:tcW w:type="dxa" w:w="2556"/>
-          </w:tcPr>
-          <w:p>
-            <w:r>
-              <w:t>175–177</w:t>
-            </w:r>
-          </w:p>
-        </w:tc>
-      </w:tr>
-      <w:tr>
-        <w:tc>
-          <w:tcPr>
-            <w:tcW w:type="dxa" w:w="2556"/>
-          </w:tcPr>
-          <w:p>
-            <w:r>
-              <w:t>7. Investigate the PulseMed ESD Incident</w:t>
-            </w:r>
-          </w:p>
-        </w:tc>
-        <w:tc>
-          <w:tcPr>
-            <w:tcW w:type="dxa" w:w="2556"/>
-          </w:tcPr>
-          <w:p>
-            <w:r>
-              <w:t>K4 · A2 · A3</w:t>
-            </w:r>
-          </w:p>
-        </w:tc>
-        <w:tc>
-          <w:tcPr>
-            <w:tcW w:type="dxa" w:w="2556"/>
-          </w:tcPr>
-          <w:p>
-            <w:r>
-              <w:t>Containment record; Timeline and causal analysis; CAPA plan; Effectiveness-verification plan</w:t>
-            </w:r>
-          </w:p>
-        </w:tc>
-        <w:tc>
-          <w:tcPr>
-            <w:tcW w:type="dxa" w:w="2556"/>
-          </w:tcPr>
-          <w:p>
-            <w:r>
-              <w:t>193–195</w:t>
-            </w:r>
-          </w:p>
-        </w:tc>
-      </w:tr>
-      <w:tr>
-        <w:tc>
-          <w:tcPr>
-            <w:tcW w:type="dxa" w:w="2556"/>
-          </w:tcPr>
-          <w:p>
-            <w:r>
+              <w:rPr>
+                <w:sz w:val="16"/>
+              </w:rPr>
               <w:t>8. Management Capstone: Build the Apex ESD Control Plan</w:t>
             </w:r>
           </w:p>
@@ -1911,9 +2172,16 @@
         <w:tc>
           <w:tcPr>
             <w:tcW w:type="dxa" w:w="2556"/>
+            <w:vAlign w:val="top"/>
           </w:tcPr>
           <w:p>
+            <w:pPr>
+              <w:spacing w:after="0" w:line="216" w:lineRule="auto"/>
+            </w:pPr>
             <w:r>
+              <w:rPr>
+                <w:sz w:val="16"/>
+              </w:rPr>
               <w:t>K1–K4 · A1–A3</w:t>
             </w:r>
           </w:p>
@@ -1921,9 +2189,16 @@
         <w:tc>
           <w:tcPr>
             <w:tcW w:type="dxa" w:w="2556"/>
+            <w:vAlign w:val="top"/>
           </w:tcPr>
           <w:p>
+            <w:pPr>
+              <w:spacing w:after="0" w:line="216" w:lineRule="auto"/>
+            </w:pPr>
             <w:r>
+              <w:rPr>
+                <w:sz w:val="16"/>
+              </w:rPr>
               <w:t>ESD control plan; Qualification and verification matrices; Competency matrix; Metrics dashboard and 90-day roadmap</w:t>
             </w:r>
           </w:p>
@@ -1931,10 +2206,17 @@
         <w:tc>
           <w:tcPr>
             <w:tcW w:type="dxa" w:w="2556"/>
+            <w:vAlign w:val="top"/>
           </w:tcPr>
           <w:p>
+            <w:pPr>
+              <w:spacing w:after="0" w:line="216" w:lineRule="auto"/>
+            </w:pPr>
             <w:r>
-              <w:t>196–198</w:t>
+              <w:rPr>
+                <w:sz w:val="16"/>
+              </w:rPr>
+              <w:t>120–122</w:t>
             </w:r>
           </w:p>
         </w:tc>
@@ -1990,7 +2272,7 @@
       <w:fldChar w:fldCharType="begin"/>
       <w:instrText xml:space="preserve">NUMPAGES</w:instrText>
       <w:fldChar w:fldCharType="separate"/>
-      <w:t>1</w:t>
+      <w:t>5</w:t>
       <w:fldChar w:fldCharType="end"/>
     </w:r>
   </w:p>

</xml_diff>